<commit_message>
docs: vincular especificación con ADR-001
</commit_message>
<xml_diff>
--- a/docs/especificacion-tecnica/Especificacion_Tecnica_v1_0_plaGesEtic.docx
+++ b/docs/especificacion-tecnica/Especificacion_Tecnica_v1_0_plaGesEtic.docx
@@ -365,7 +365,7 @@
               <w:rPr>
                 <w:sz w:val="20"/>
               </w:rPr>
-              <w:t>Aplicación web, API, base de datos y almacenamiento como contenedores lógicos. Framework web y tecnología del almacenamiento por definir.</w:t>
+              <w:t>Docker (ADR-001). Aplicación web, API, base de datos y almacenamiento como contenedores lógicos. Framework web y tecnología del almacenamiento por definir.</w:t>
             </w:r>
           </w:p>
         </w:tc>
@@ -2306,6 +2306,19 @@
       <w:pPr>
         <w:spacing w:after="80"/>
       </w:pPr>
+      <w:hyperlink r:id="rId20">
+        <w:r>
+          <w:rPr>
+            <w:rStyle w:val="Hyperlink"/>
+          </w:rPr>
+          <w:t>ADR-001 · Stack tecnológico: Node.js, Express, PostgreSQL y Docker (aceptado)</w:t>
+        </w:r>
+      </w:hyperlink>
+    </w:p>
+    <w:p>
+      <w:pPr>
+        <w:spacing w:after="80"/>
+      </w:pPr>
       <w:hyperlink r:id="rId13">
         <w:r>
           <w:rPr>

</xml_diff>